<commit_message>
added dhumketu. backup logo of vehicle etc
</commit_message>
<xml_diff>
--- a/files/2025/Flow.docx
+++ b/files/2025/Flow.docx
@@ -144,63 +144,27 @@
               </w:rPr>
               <w:t xml:space="preserve">Obtain </w:t>
             </w:r>
-          </w:p>
-          <w:p>
-            <w:pPr>
-              <w:jc w:val="center"/>
+            <w:r>
               <w:rPr>
                 <w:b/>
                 <w:bCs/>
                 <w:lang w:val="en-IN"/>
               </w:rPr>
-            </w:pPr>
-            <w:r>
-              <w:rPr>
-                <w:b/>
-                <w:bCs/>
-                <w:lang w:val="en-IN"/>
-              </w:rPr>
-              <w:t>Format for Institutional Entries</w:t>
-            </w:r>
-          </w:p>
-          <w:p>
-            <w:pPr>
-              <w:jc w:val="center"/>
-              <w:rPr>
-                <w:lang w:val="en-IN"/>
-              </w:rPr>
-            </w:pPr>
-            <w:r>
-              <w:rPr>
-                <w:lang w:val="en-IN"/>
-              </w:rPr>
-              <w:t>and</w:t>
-            </w:r>
-            <w:r>
-              <w:rPr>
-                <w:lang w:val="en-IN"/>
-              </w:rPr>
-              <w:t xml:space="preserve"> </w:t>
-            </w:r>
-            <w:r>
-              <w:rPr>
-                <w:b/>
-                <w:bCs/>
-                <w:lang w:val="en-IN"/>
-              </w:rPr>
-              <w:t>Letter for Forwarding Institution Details</w:t>
-            </w:r>
-            <w:r>
-              <w:rPr>
-                <w:lang w:val="en-IN"/>
-              </w:rPr>
-              <w:t xml:space="preserve"> from</w:t>
-            </w:r>
-          </w:p>
-          <w:p>
-            <w:pPr>
-              <w:jc w:val="center"/>
-              <w:rPr>
+              <w:t xml:space="preserve">Format </w:t>
+            </w:r>
+            <w:r>
+              <w:rPr>
+                <w:lang w:val="en-IN"/>
+              </w:rPr>
+              <w:t>from</w:t>
+            </w:r>
+          </w:p>
+          <w:p>
+            <w:pPr>
+              <w:jc w:val="center"/>
+              <w:rPr>
+                <w:sz w:val="18"/>
+                <w:szCs w:val="18"/>
                 <w:lang w:val="en-IN"/>
               </w:rPr>
             </w:pPr>
@@ -212,9 +176,62 @@
                   <w:szCs w:val="18"/>
                   <w:lang w:val="en-IN"/>
                 </w:rPr>
-                <w:t>https://aryabhat.org/download.html</w:t>
+                <w:t>https://aryabhat.org/q</w:t>
+              </w:r>
+              <w:proofErr w:type="spellStart"/>
+              <w:r>
+                <w:rPr>
+                  <w:rStyle w:val="Hyperlink"/>
+                  <w:sz w:val="18"/>
+                  <w:szCs w:val="18"/>
+                </w:rPr>
+                <w:t>uiz</w:t>
+              </w:r>
+              <w:proofErr w:type="spellEnd"/>
+              <w:r>
+                <w:rPr>
+                  <w:rStyle w:val="Hyperlink"/>
+                  <w:sz w:val="18"/>
+                  <w:szCs w:val="18"/>
+                  <w:lang w:val="en-IN"/>
+                </w:rPr>
+                <w:t>.html</w:t>
               </w:r>
             </w:hyperlink>
+          </w:p>
+          <w:p>
+            <w:pPr>
+              <w:jc w:val="center"/>
+              <w:rPr>
+                <w:sz w:val="18"/>
+                <w:szCs w:val="18"/>
+                <w:lang w:val="en-IN"/>
+              </w:rPr>
+            </w:pPr>
+          </w:p>
+          <w:p>
+            <w:pPr>
+              <w:jc w:val="center"/>
+              <w:rPr>
+                <w:lang w:val="en-IN"/>
+              </w:rPr>
+            </w:pPr>
+            <w:r>
+              <w:rPr>
+                <w:sz w:val="18"/>
+                <w:szCs w:val="18"/>
+                <w:lang w:val="en-IN"/>
+              </w:rPr>
+              <w:t xml:space="preserve">Section: </w:t>
+            </w:r>
+            <w:r>
+              <w:rPr>
+                <w:sz w:val="18"/>
+                <w:szCs w:val="18"/>
+                <w:lang w:val="en-IN"/>
+              </w:rPr>
+              <w:t>Registration for Schools</w:t>
+            </w:r>
           </w:p>
         </w:tc>
         <w:tc>
@@ -274,19 +291,19 @@
               <w:rPr>
                 <w:lang w:val="en-IN"/>
               </w:rPr>
-              <w:t xml:space="preserve">Send </w:t>
-            </w:r>
-            <w:r>
-              <w:rPr>
-                <w:lang w:val="en-IN"/>
-              </w:rPr>
-              <w:t>both</w:t>
-            </w:r>
-            <w:r>
-              <w:rPr>
-                <w:lang w:val="en-IN"/>
-              </w:rPr>
-              <w:t xml:space="preserve"> filled-up format </w:t>
+              <w:t>Send</w:t>
+            </w:r>
+            <w:r>
+              <w:rPr>
+                <w:lang w:val="en-IN"/>
+              </w:rPr>
+              <w:t xml:space="preserve"> </w:t>
+            </w:r>
+            <w:r>
+              <w:rPr>
+                <w:lang w:val="en-IN"/>
+              </w:rPr>
+              <w:t xml:space="preserve">filled-up format </w:t>
             </w:r>
           </w:p>
           <w:p>
@@ -1253,6 +1270,18 @@
         </w:rPr>
         <w:t>First Name</w:t>
       </w:r>
+      <w:r>
+        <w:rPr>
+          <w:rFonts w:ascii="Calibri" w:eastAsia="Times New Roman" w:hAnsi="Calibri" w:cs="Calibri"/>
+          <w:color w:val="000000"/>
+          <w:kern w:val="0"/>
+          <w:sz w:val="20"/>
+          <w:szCs w:val="20"/>
+          <w:lang w:eastAsia="en-GB" w:bidi="hi-IN"/>
+          <w14:ligatures w14:val="none"/>
+        </w:rPr>
+        <w:t xml:space="preserve"> of the participant</w:t>
+      </w:r>
     </w:p>
     <w:p>
       <w:pPr>
@@ -1284,6 +1313,38 @@
           <w14:ligatures w14:val="none"/>
         </w:rPr>
         <w:t>Last Name</w:t>
+      </w:r>
+    </w:p>
+    <w:p>
+      <w:pPr>
+        <w:pStyle w:val="ListParagraph"/>
+        <w:numPr>
+          <w:ilvl w:val="0"/>
+          <w:numId w:val="1"/>
+        </w:numPr>
+        <w:spacing w:before="0" w:after="0" w:line="240" w:lineRule="auto"/>
+        <w:jc w:val="left"/>
+        <w:rPr>
+          <w:rFonts w:ascii="Calibri" w:eastAsia="Times New Roman" w:hAnsi="Calibri" w:cs="Calibri"/>
+          <w:color w:val="000000"/>
+          <w:kern w:val="0"/>
+          <w:sz w:val="20"/>
+          <w:szCs w:val="20"/>
+          <w:lang w:eastAsia="en-GB" w:bidi="hi-IN"/>
+          <w14:ligatures w14:val="none"/>
+        </w:rPr>
+      </w:pPr>
+      <w:r>
+        <w:rPr>
+          <w:rFonts w:ascii="Calibri" w:eastAsia="Times New Roman" w:hAnsi="Calibri" w:cs="Calibri"/>
+          <w:color w:val="000000"/>
+          <w:kern w:val="0"/>
+          <w:sz w:val="20"/>
+          <w:szCs w:val="20"/>
+          <w:lang w:eastAsia="en-GB" w:bidi="hi-IN"/>
+          <w14:ligatures w14:val="none"/>
+        </w:rPr>
+        <w:t>Gender</w:t>
       </w:r>
     </w:p>
     <w:p>
@@ -1347,7 +1408,33 @@
           <w:lang w:eastAsia="en-GB" w:bidi="hi-IN"/>
           <w14:ligatures w14:val="none"/>
         </w:rPr>
-        <w:t>Date of Birth (yyyy.mm.dd)</w:t>
+        <w:t>Date of Birth (</w:t>
+      </w:r>
+      <w:proofErr w:type="spellStart"/>
+      <w:r>
+        <w:rPr>
+          <w:rFonts w:ascii="Calibri" w:eastAsia="Times New Roman" w:hAnsi="Calibri" w:cs="Calibri"/>
+          <w:color w:val="000000"/>
+          <w:kern w:val="0"/>
+          <w:sz w:val="20"/>
+          <w:szCs w:val="20"/>
+          <w:lang w:eastAsia="en-GB" w:bidi="hi-IN"/>
+          <w14:ligatures w14:val="none"/>
+        </w:rPr>
+        <w:t>dd.mm.yy</w:t>
+      </w:r>
+      <w:proofErr w:type="spellEnd"/>
+      <w:r>
+        <w:rPr>
+          <w:rFonts w:ascii="Calibri" w:eastAsia="Times New Roman" w:hAnsi="Calibri" w:cs="Calibri"/>
+          <w:color w:val="000000"/>
+          <w:kern w:val="0"/>
+          <w:sz w:val="20"/>
+          <w:szCs w:val="20"/>
+          <w:lang w:eastAsia="en-GB" w:bidi="hi-IN"/>
+          <w14:ligatures w14:val="none"/>
+        </w:rPr>
+        <w:t>)</w:t>
       </w:r>
     </w:p>
     <w:p>
@@ -1360,13 +1447,7 @@
         <w:spacing w:before="0" w:after="0" w:line="240" w:lineRule="auto"/>
         <w:jc w:val="left"/>
         <w:rPr>
-          <w:rFonts w:ascii="Calibri" w:eastAsia="Times New Roman" w:hAnsi="Calibri" w:cs="Calibri"/>
-          <w:color w:val="000000"/>
-          <w:kern w:val="0"/>
-          <w:sz w:val="20"/>
-          <w:szCs w:val="20"/>
-          <w:lang w:eastAsia="en-GB" w:bidi="hi-IN"/>
-          <w14:ligatures w14:val="none"/>
+          <w:lang w:val="en-IN"/>
         </w:rPr>
       </w:pPr>
       <w:r>
@@ -1379,7 +1460,19 @@
           <w:lang w:eastAsia="en-GB" w:bidi="hi-IN"/>
           <w14:ligatures w14:val="none"/>
         </w:rPr>
-        <w:t>Gender (M/F)</w:t>
+        <w:t>Class</w:t>
+      </w:r>
+      <w:r>
+        <w:rPr>
+          <w:rFonts w:ascii="Calibri" w:eastAsia="Times New Roman" w:hAnsi="Calibri" w:cs="Calibri"/>
+          <w:color w:val="000000"/>
+          <w:kern w:val="0"/>
+          <w:sz w:val="20"/>
+          <w:szCs w:val="20"/>
+          <w:lang w:eastAsia="en-GB" w:bidi="hi-IN"/>
+          <w14:ligatures w14:val="none"/>
+        </w:rPr>
+        <w:t xml:space="preserve"> (6 to 9)</w:t>
       </w:r>
     </w:p>
     <w:p>
@@ -1392,13 +1485,7 @@
         <w:spacing w:before="0" w:after="0" w:line="240" w:lineRule="auto"/>
         <w:jc w:val="left"/>
         <w:rPr>
-          <w:rFonts w:ascii="Calibri" w:eastAsia="Times New Roman" w:hAnsi="Calibri" w:cs="Calibri"/>
-          <w:color w:val="000000"/>
-          <w:kern w:val="0"/>
-          <w:sz w:val="20"/>
-          <w:szCs w:val="20"/>
-          <w:lang w:eastAsia="en-GB" w:bidi="hi-IN"/>
-          <w14:ligatures w14:val="none"/>
+          <w:lang w:val="en-IN"/>
         </w:rPr>
       </w:pPr>
       <w:r>
@@ -1411,239 +1498,8 @@
           <w:lang w:eastAsia="en-GB" w:bidi="hi-IN"/>
           <w14:ligatures w14:val="none"/>
         </w:rPr>
-        <w:t>Aadhar No</w:t>
+        <w:t>Section</w:t>
       </w:r>
-    </w:p>
-    <w:p>
-      <w:pPr>
-        <w:pStyle w:val="ListParagraph"/>
-        <w:numPr>
-          <w:ilvl w:val="0"/>
-          <w:numId w:val="1"/>
-        </w:numPr>
-        <w:spacing w:before="0" w:after="0" w:line="240" w:lineRule="auto"/>
-        <w:jc w:val="left"/>
-        <w:rPr>
-          <w:rFonts w:ascii="Calibri" w:eastAsia="Times New Roman" w:hAnsi="Calibri" w:cs="Calibri"/>
-          <w:color w:val="000000"/>
-          <w:kern w:val="0"/>
-          <w:sz w:val="20"/>
-          <w:szCs w:val="20"/>
-          <w:lang w:eastAsia="en-GB" w:bidi="hi-IN"/>
-          <w14:ligatures w14:val="none"/>
-        </w:rPr>
-      </w:pPr>
-      <w:r>
-        <w:rPr>
-          <w:rFonts w:ascii="Calibri" w:eastAsia="Times New Roman" w:hAnsi="Calibri" w:cs="Calibri"/>
-          <w:color w:val="000000"/>
-          <w:kern w:val="0"/>
-          <w:sz w:val="20"/>
-          <w:szCs w:val="20"/>
-          <w:lang w:eastAsia="en-GB" w:bidi="hi-IN"/>
-          <w14:ligatures w14:val="none"/>
-        </w:rPr>
-        <w:t>Standard (6 to 9)</w:t>
-      </w:r>
-    </w:p>
-    <w:p>
-      <w:pPr>
-        <w:pStyle w:val="ListParagraph"/>
-        <w:numPr>
-          <w:ilvl w:val="0"/>
-          <w:numId w:val="1"/>
-        </w:numPr>
-        <w:spacing w:before="0" w:after="0" w:line="240" w:lineRule="auto"/>
-        <w:jc w:val="left"/>
-        <w:rPr>
-          <w:rFonts w:ascii="Calibri" w:eastAsia="Times New Roman" w:hAnsi="Calibri" w:cs="Calibri"/>
-          <w:color w:val="000000"/>
-          <w:kern w:val="0"/>
-          <w:sz w:val="20"/>
-          <w:szCs w:val="20"/>
-          <w:lang w:eastAsia="en-GB" w:bidi="hi-IN"/>
-          <w14:ligatures w14:val="none"/>
-        </w:rPr>
-      </w:pPr>
-      <w:r>
-        <w:rPr>
-          <w:rFonts w:ascii="Calibri" w:eastAsia="Times New Roman" w:hAnsi="Calibri" w:cs="Calibri"/>
-          <w:color w:val="000000"/>
-          <w:kern w:val="0"/>
-          <w:sz w:val="20"/>
-          <w:szCs w:val="20"/>
-          <w:lang w:eastAsia="en-GB" w:bidi="hi-IN"/>
-          <w14:ligatures w14:val="none"/>
-        </w:rPr>
-        <w:t>School Name</w:t>
-      </w:r>
-    </w:p>
-    <w:p>
-      <w:pPr>
-        <w:pStyle w:val="ListParagraph"/>
-        <w:numPr>
-          <w:ilvl w:val="0"/>
-          <w:numId w:val="1"/>
-        </w:numPr>
-        <w:spacing w:before="0" w:after="0" w:line="240" w:lineRule="auto"/>
-        <w:jc w:val="left"/>
-        <w:rPr>
-          <w:rFonts w:ascii="Calibri" w:eastAsia="Times New Roman" w:hAnsi="Calibri" w:cs="Calibri"/>
-          <w:color w:val="000000"/>
-          <w:kern w:val="0"/>
-          <w:sz w:val="20"/>
-          <w:szCs w:val="20"/>
-          <w:lang w:eastAsia="en-GB" w:bidi="hi-IN"/>
-          <w14:ligatures w14:val="none"/>
-        </w:rPr>
-      </w:pPr>
-      <w:r>
-        <w:rPr>
-          <w:rFonts w:ascii="Calibri" w:eastAsia="Times New Roman" w:hAnsi="Calibri" w:cs="Calibri"/>
-          <w:color w:val="000000"/>
-          <w:kern w:val="0"/>
-          <w:sz w:val="20"/>
-          <w:szCs w:val="20"/>
-          <w:lang w:eastAsia="en-GB" w:bidi="hi-IN"/>
-          <w14:ligatures w14:val="none"/>
-        </w:rPr>
-        <w:t>School Address</w:t>
-      </w:r>
-    </w:p>
-    <w:p>
-      <w:pPr>
-        <w:pStyle w:val="ListParagraph"/>
-        <w:numPr>
-          <w:ilvl w:val="0"/>
-          <w:numId w:val="1"/>
-        </w:numPr>
-        <w:spacing w:before="0" w:after="0" w:line="240" w:lineRule="auto"/>
-        <w:jc w:val="left"/>
-        <w:rPr>
-          <w:rFonts w:ascii="Calibri" w:eastAsia="Times New Roman" w:hAnsi="Calibri" w:cs="Calibri"/>
-          <w:color w:val="000000"/>
-          <w:kern w:val="0"/>
-          <w:sz w:val="20"/>
-          <w:szCs w:val="20"/>
-          <w:lang w:eastAsia="en-GB" w:bidi="hi-IN"/>
-          <w14:ligatures w14:val="none"/>
-        </w:rPr>
-      </w:pPr>
-      <w:r>
-        <w:rPr>
-          <w:rFonts w:ascii="Calibri" w:eastAsia="Times New Roman" w:hAnsi="Calibri" w:cs="Calibri"/>
-          <w:color w:val="000000"/>
-          <w:kern w:val="0"/>
-          <w:sz w:val="20"/>
-          <w:szCs w:val="20"/>
-          <w:lang w:eastAsia="en-GB" w:bidi="hi-IN"/>
-          <w14:ligatures w14:val="none"/>
-        </w:rPr>
-        <w:t>School City</w:t>
-      </w:r>
-    </w:p>
-    <w:p>
-      <w:pPr>
-        <w:pStyle w:val="ListParagraph"/>
-        <w:numPr>
-          <w:ilvl w:val="0"/>
-          <w:numId w:val="1"/>
-        </w:numPr>
-        <w:spacing w:before="0" w:after="0" w:line="240" w:lineRule="auto"/>
-        <w:jc w:val="left"/>
-        <w:rPr>
-          <w:rFonts w:ascii="Calibri" w:eastAsia="Times New Roman" w:hAnsi="Calibri" w:cs="Calibri"/>
-          <w:color w:val="000000"/>
-          <w:kern w:val="0"/>
-          <w:sz w:val="20"/>
-          <w:szCs w:val="20"/>
-          <w:lang w:eastAsia="en-GB" w:bidi="hi-IN"/>
-          <w14:ligatures w14:val="none"/>
-        </w:rPr>
-      </w:pPr>
-      <w:r>
-        <w:rPr>
-          <w:rFonts w:ascii="Calibri" w:eastAsia="Times New Roman" w:hAnsi="Calibri" w:cs="Calibri"/>
-          <w:color w:val="000000"/>
-          <w:kern w:val="0"/>
-          <w:sz w:val="20"/>
-          <w:szCs w:val="20"/>
-          <w:lang w:eastAsia="en-GB" w:bidi="hi-IN"/>
-          <w14:ligatures w14:val="none"/>
-        </w:rPr>
-        <w:t>School District</w:t>
-      </w:r>
-    </w:p>
-    <w:p>
-      <w:pPr>
-        <w:pStyle w:val="ListParagraph"/>
-        <w:numPr>
-          <w:ilvl w:val="0"/>
-          <w:numId w:val="1"/>
-        </w:numPr>
-        <w:spacing w:before="0" w:after="0" w:line="240" w:lineRule="auto"/>
-        <w:jc w:val="left"/>
-        <w:rPr>
-          <w:rFonts w:ascii="Calibri" w:eastAsia="Times New Roman" w:hAnsi="Calibri" w:cs="Calibri"/>
-          <w:color w:val="000000"/>
-          <w:kern w:val="0"/>
-          <w:sz w:val="20"/>
-          <w:szCs w:val="20"/>
-          <w:lang w:eastAsia="en-GB" w:bidi="hi-IN"/>
-          <w14:ligatures w14:val="none"/>
-        </w:rPr>
-      </w:pPr>
-      <w:r>
-        <w:rPr>
-          <w:rFonts w:ascii="Calibri" w:eastAsia="Times New Roman" w:hAnsi="Calibri" w:cs="Calibri"/>
-          <w:color w:val="000000"/>
-          <w:kern w:val="0"/>
-          <w:sz w:val="20"/>
-          <w:szCs w:val="20"/>
-          <w:lang w:eastAsia="en-GB" w:bidi="hi-IN"/>
-          <w14:ligatures w14:val="none"/>
-        </w:rPr>
-        <w:t>Mobile (10 Digit)</w:t>
-      </w:r>
-    </w:p>
-    <w:p>
-      <w:pPr>
-        <w:pStyle w:val="ListParagraph"/>
-        <w:numPr>
-          <w:ilvl w:val="0"/>
-          <w:numId w:val="1"/>
-        </w:numPr>
-        <w:spacing w:before="0" w:after="0" w:line="240" w:lineRule="auto"/>
-        <w:jc w:val="left"/>
-        <w:rPr>
-          <w:rFonts w:ascii="Calibri" w:eastAsia="Times New Roman" w:hAnsi="Calibri" w:cs="Calibri"/>
-          <w:color w:val="000000"/>
-          <w:kern w:val="0"/>
-          <w:sz w:val="20"/>
-          <w:szCs w:val="20"/>
-          <w:lang w:eastAsia="en-GB" w:bidi="hi-IN"/>
-          <w14:ligatures w14:val="none"/>
-        </w:rPr>
-      </w:pPr>
-      <w:r>
-        <w:rPr>
-          <w:rFonts w:ascii="Calibri" w:eastAsia="Times New Roman" w:hAnsi="Calibri" w:cs="Calibri"/>
-          <w:color w:val="000000"/>
-          <w:kern w:val="0"/>
-          <w:sz w:val="20"/>
-          <w:szCs w:val="20"/>
-          <w:lang w:eastAsia="en-GB" w:bidi="hi-IN"/>
-          <w14:ligatures w14:val="none"/>
-        </w:rPr>
-        <w:t>Email</w:t>
-      </w:r>
-    </w:p>
-    <w:p>
-      <w:pPr>
-        <w:rPr>
-          <w:lang w:val="en-IN"/>
-        </w:rPr>
-      </w:pPr>
     </w:p>
     <w:sectPr>
       <w:headerReference w:type="default" r:id="rId10"/>
@@ -1741,7 +1597,7 @@
         <w:szCs w:val="24"/>
         <w:lang w:val="en-IN"/>
       </w:rPr>
-      <w:t>5</w:t>
+      <w:t>6</w:t>
     </w:r>
     <w:r>
       <w:rPr>
@@ -1763,7 +1619,7 @@
         <w:szCs w:val="24"/>
         <w:lang w:val="en-IN"/>
       </w:rPr>
-      <w:t>6</w:t>
+      <w:t>7</w:t>
     </w:r>
   </w:p>
   <w:p>
@@ -1800,8 +1656,8 @@
   <w:abstractNum w:abstractNumId="0" w15:restartNumberingAfterBreak="0">
     <w:nsid w:val="41436035"/>
     <w:multiLevelType w:val="hybridMultilevel"/>
-    <w:tmpl w:val="93662C4A"/>
-    <w:lvl w:ilvl="0" w:tplc="D5C21428">
+    <w:tmpl w:val="01E649A4"/>
+    <w:lvl w:ilvl="0" w:tplc="A530C732">
       <w:start w:val="1"/>
       <w:numFmt w:val="decimal"/>
       <w:lvlText w:val="%1."/>
@@ -1810,7 +1666,9 @@
         <w:ind w:left="720" w:hanging="360"/>
       </w:pPr>
       <w:rPr>
-        <w:rFonts w:hint="default"/>
+        <w:rFonts w:ascii="Calibri" w:hAnsi="Calibri" w:cs="Calibri" w:hint="default"/>
+        <w:sz w:val="20"/>
+        <w:szCs w:val="20"/>
       </w:rPr>
     </w:lvl>
     <w:lvl w:ilvl="1" w:tplc="08090019" w:tentative="1">
@@ -2418,6 +2276,18 @@
       <w:contextualSpacing/>
     </w:pPr>
   </w:style>
+  <w:style w:type="character" w:styleId="FollowedHyperlink">
+    <w:name w:val="FollowedHyperlink"/>
+    <w:basedOn w:val="DefaultParagraphFont"/>
+    <w:uiPriority w:val="99"/>
+    <w:semiHidden/>
+    <w:unhideWhenUsed/>
+    <w:rsid w:val="00984C88"/>
+    <w:rPr>
+      <w:color w:val="800080" w:themeColor="followedHyperlink"/>
+      <w:u w:val="single"/>
+    </w:rPr>
+  </w:style>
 </w:styles>
 </file>
 

</xml_diff>

<commit_message>
updated link to quiz format
</commit_message>
<xml_diff>
--- a/files/2025/Flow.docx
+++ b/files/2025/Flow.docx
@@ -1,6 +1,6 @@
 
 <file path=word/document.xml><?xml version="1.0" encoding="utf-8"?>
-<w:document xmlns:wpc="http://schemas.microsoft.com/office/word/2010/wordprocessingCanvas" xmlns:cx="http://schemas.microsoft.com/office/drawing/2014/chartex" xmlns:cx1="http://schemas.microsoft.com/office/drawing/2015/9/8/chartex" xmlns:cx2="http://schemas.microsoft.com/office/drawing/2015/10/21/chartex" xmlns:cx3="http://schemas.microsoft.com/office/drawing/2016/5/9/chartex" xmlns:cx4="http://schemas.microsoft.com/office/drawing/2016/5/10/chartex" xmlns:cx5="http://schemas.microsoft.com/office/drawing/2016/5/11/chartex" xmlns:cx6="http://schemas.microsoft.com/office/drawing/2016/5/12/chartex" xmlns:cx7="http://schemas.microsoft.com/office/drawing/2016/5/13/chartex" xmlns:cx8="http://schemas.microsoft.com/office/drawing/2016/5/14/chartex" xmlns:mc="http://schemas.openxmlformats.org/markup-compatibility/2006" xmlns:aink="http://schemas.microsoft.com/office/drawing/2016/ink" xmlns:am3d="http://schemas.microsoft.com/office/drawing/2017/model3d" xmlns:o="urn:schemas-microsoft-com:office:office" xmlns:oel="http://schemas.microsoft.com/office/2019/extlst" xmlns:r="http://schemas.openxmlformats.org/officeDocument/2006/relationships" xmlns:m="http://schemas.openxmlformats.org/officeDocument/2006/math" xmlns:v="urn:schemas-microsoft-com:vml" xmlns:wp14="http://schemas.microsoft.com/office/word/2010/wordprocessingDrawing" xmlns:wp="http://schemas.openxmlformats.org/drawingml/2006/wordprocessingDrawing" xmlns:w10="urn:schemas-microsoft-com:office:word" xmlns:w="http://schemas.openxmlformats.org/wordprocessingml/2006/main" xmlns:w14="http://schemas.microsoft.com/office/word/2010/wordml" xmlns:w15="http://schemas.microsoft.com/office/word/2012/wordml" xmlns:w16cex="http://schemas.microsoft.com/office/word/2018/wordml/cex" xmlns:w16cid="http://schemas.microsoft.com/office/word/2016/wordml/cid" xmlns:w16="http://schemas.microsoft.com/office/word/2018/wordml" xmlns:w16du="http://schemas.microsoft.com/office/word/2023/wordml/word16du" xmlns:w16sdtdh="http://schemas.microsoft.com/office/word/2020/wordml/sdtdatahash" xmlns:w16sdtfl="http://schemas.microsoft.com/office/word/2024/wordml/sdtformatlock" xmlns:w16se="http://schemas.microsoft.com/office/word/2015/wordml/symex" xmlns:wpg="http://schemas.microsoft.com/office/word/2010/wordprocessingGroup" xmlns:wpi="http://schemas.microsoft.com/office/word/2010/wordprocessingInk" xmlns:wne="http://schemas.microsoft.com/office/word/2006/wordml" xmlns:wps="http://schemas.microsoft.com/office/word/2010/wordprocessingShape" mc:Ignorable="w14 w15 w16se w16cid w16 w16cex w16sdtdh w16sdtfl w16du wp14">
+<w:document xmlns:wpc="http://schemas.microsoft.com/office/word/2010/wordprocessingCanvas" xmlns:cx="http://schemas.microsoft.com/office/drawing/2014/chartex" xmlns:cx1="http://schemas.microsoft.com/office/drawing/2015/9/8/chartex" xmlns:cx2="http://schemas.microsoft.com/office/drawing/2015/10/21/chartex" xmlns:cx3="http://schemas.microsoft.com/office/drawing/2016/5/9/chartex" xmlns:cx4="http://schemas.microsoft.com/office/drawing/2016/5/10/chartex" xmlns:cx5="http://schemas.microsoft.com/office/drawing/2016/5/11/chartex" xmlns:cx6="http://schemas.microsoft.com/office/drawing/2016/5/12/chartex" xmlns:cx7="http://schemas.microsoft.com/office/drawing/2016/5/13/chartex" xmlns:cx8="http://schemas.microsoft.com/office/drawing/2016/5/14/chartex" xmlns:mc="http://schemas.openxmlformats.org/markup-compatibility/2006" xmlns:m="http://schemas.openxmlformats.org/officeDocument/2006/math" xmlns:aink="http://schemas.microsoft.com/office/drawing/2016/ink" xmlns:am3d="http://schemas.microsoft.com/office/drawing/2017/model3d" xmlns:oel="http://schemas.microsoft.com/office/2019/extlst" xmlns:r="http://schemas.openxmlformats.org/officeDocument/2006/relationships" xmlns:wp14="http://schemas.microsoft.com/office/word/2010/wordprocessingDrawing" xmlns:wp="http://schemas.openxmlformats.org/drawingml/2006/wordprocessingDrawing" xmlns:wpg="http://schemas.microsoft.com/office/word/2010/wordprocessingGroup" xmlns:wpi="http://schemas.microsoft.com/office/word/2010/wordprocessingInk" xmlns:wps="http://schemas.microsoft.com/office/word/2010/wordprocessingShape" xmlns:o="urn:schemas-microsoft-com:office:office" xmlns:v="urn:schemas-microsoft-com:vml" xmlns:w10="urn:schemas-microsoft-com:office:word" xmlns:w="http://schemas.openxmlformats.org/wordprocessingml/2006/main" xmlns:w14="http://schemas.microsoft.com/office/word/2010/wordml" xmlns:w15="http://schemas.microsoft.com/office/word/2012/wordml" xmlns:w16cex="http://schemas.microsoft.com/office/word/2018/wordml/cex" xmlns:w16cid="http://schemas.microsoft.com/office/word/2016/wordml/cid" xmlns:w16="http://schemas.microsoft.com/office/word/2018/wordml" xmlns:w16sdtdh="http://schemas.microsoft.com/office/word/2020/wordml/sdtdatahash" xmlns:w16sdtfl="http://schemas.microsoft.com/office/word/2024/wordml/sdtformatlock" xmlns:w16se="http://schemas.microsoft.com/office/word/2015/wordml/symex" xmlns:w16du="http://schemas.microsoft.com/office/word/2023/wordml/word16du" xmlns:wne="http://schemas.microsoft.com/office/word/2006/wordml" mc:Ignorable="w14 w15 w16se w16cid w16 w16cex w16sdtdh w16sdtfl w16du wp14">
   <w:body>
     <w:tbl>
       <w:tblPr>
@@ -178,7 +178,6 @@
                 </w:rPr>
                 <w:t>https://aryabhat.org/q</w:t>
               </w:r>
-              <w:proofErr w:type="spellStart"/>
               <w:r>
                 <w:rPr>
                   <w:rStyle w:val="Hyperlink"/>
@@ -187,7 +186,6 @@
                 </w:rPr>
                 <w:t>uiz</w:t>
               </w:r>
-              <w:proofErr w:type="spellEnd"/>
               <w:r>
                 <w:rPr>
                   <w:rStyle w:val="Hyperlink"/>
@@ -195,7 +193,7 @@
                   <w:szCs w:val="18"/>
                   <w:lang w:val="en-IN"/>
                 </w:rPr>
-                <w:t>.html</w:t>
+                <w:t>form</w:t>
               </w:r>
             </w:hyperlink>
           </w:p>
@@ -942,25 +940,7 @@
                 <w:szCs w:val="16"/>
                 <w:lang w:val="en-IN"/>
               </w:rPr>
-              <w:t xml:space="preserve">in presence of </w:t>
-            </w:r>
-            <w:proofErr w:type="spellStart"/>
-            <w:r>
-              <w:rPr>
-                <w:sz w:val="16"/>
-                <w:szCs w:val="16"/>
-                <w:lang w:val="en-IN"/>
-              </w:rPr>
-              <w:t>Aryabhat’s</w:t>
-            </w:r>
-            <w:proofErr w:type="spellEnd"/>
-            <w:r>
-              <w:rPr>
-                <w:sz w:val="16"/>
-                <w:szCs w:val="16"/>
-                <w:lang w:val="en-IN"/>
-              </w:rPr>
-              <w:t xml:space="preserve"> representative</w:t>
+              <w:t>in presence of Aryabhat’s representative</w:t>
             </w:r>
           </w:p>
         </w:tc>
@@ -1446,19 +1426,11 @@
                 <w:lang w:eastAsia="en-GB" w:bidi="hi-IN"/>
               </w:rPr>
             </w:pPr>
-            <w:proofErr w:type="spellStart"/>
             <w:r>
               <w:rPr>
                 <w:lang w:eastAsia="en-GB" w:bidi="hi-IN"/>
               </w:rPr>
-              <w:t>Whatsapp</w:t>
-            </w:r>
-            <w:proofErr w:type="spellEnd"/>
-            <w:r>
-              <w:rPr>
-                <w:lang w:eastAsia="en-GB" w:bidi="hi-IN"/>
-              </w:rPr>
-              <w:t xml:space="preserve"> No</w:t>
+              <w:t>Whatsapp No</w:t>
             </w:r>
           </w:p>
         </w:tc>
@@ -1653,35 +1625,7 @@
                 <w:lang w:eastAsia="en-GB" w:bidi="hi-IN"/>
                 <w14:ligatures w14:val="none"/>
               </w:rPr>
-              <w:t>Date of Birth (</w:t>
-            </w:r>
-            <w:proofErr w:type="spellStart"/>
-            <w:proofErr w:type="gramStart"/>
-            <w:r>
-              <w:rPr>
-                <w:rFonts w:eastAsia="Times New Roman"/>
-                <w:color w:val="000000"/>
-                <w:kern w:val="0"/>
-                <w:sz w:val="20"/>
-                <w:szCs w:val="20"/>
-                <w:lang w:eastAsia="en-GB" w:bidi="hi-IN"/>
-                <w14:ligatures w14:val="none"/>
-              </w:rPr>
-              <w:t>dd.mm.yy</w:t>
-            </w:r>
-            <w:proofErr w:type="spellEnd"/>
-            <w:proofErr w:type="gramEnd"/>
-            <w:r>
-              <w:rPr>
-                <w:rFonts w:eastAsia="Times New Roman"/>
-                <w:color w:val="000000"/>
-                <w:kern w:val="0"/>
-                <w:sz w:val="20"/>
-                <w:szCs w:val="20"/>
-                <w:lang w:eastAsia="en-GB" w:bidi="hi-IN"/>
-                <w14:ligatures w14:val="none"/>
-              </w:rPr>
-              <w:t>)</w:t>
+              <w:t>Date of Birth (dd.mm.yy)</w:t>
             </w:r>
           </w:p>
           <w:p>
@@ -1799,7 +1743,7 @@
 </file>
 
 <file path=word/endnotes.xml><?xml version="1.0" encoding="utf-8"?>
-<w:endnotes xmlns:wpc="http://schemas.microsoft.com/office/word/2010/wordprocessingCanvas" xmlns:cx="http://schemas.microsoft.com/office/drawing/2014/chartex" xmlns:cx1="http://schemas.microsoft.com/office/drawing/2015/9/8/chartex" xmlns:cx2="http://schemas.microsoft.com/office/drawing/2015/10/21/chartex" xmlns:cx3="http://schemas.microsoft.com/office/drawing/2016/5/9/chartex" xmlns:cx4="http://schemas.microsoft.com/office/drawing/2016/5/10/chartex" xmlns:cx5="http://schemas.microsoft.com/office/drawing/2016/5/11/chartex" xmlns:cx6="http://schemas.microsoft.com/office/drawing/2016/5/12/chartex" xmlns:cx7="http://schemas.microsoft.com/office/drawing/2016/5/13/chartex" xmlns:cx8="http://schemas.microsoft.com/office/drawing/2016/5/14/chartex" xmlns:mc="http://schemas.openxmlformats.org/markup-compatibility/2006" xmlns:aink="http://schemas.microsoft.com/office/drawing/2016/ink" xmlns:am3d="http://schemas.microsoft.com/office/drawing/2017/model3d" xmlns:o="urn:schemas-microsoft-com:office:office" xmlns:oel="http://schemas.microsoft.com/office/2019/extlst" xmlns:r="http://schemas.openxmlformats.org/officeDocument/2006/relationships" xmlns:m="http://schemas.openxmlformats.org/officeDocument/2006/math" xmlns:v="urn:schemas-microsoft-com:vml" xmlns:wp14="http://schemas.microsoft.com/office/word/2010/wordprocessingDrawing" xmlns:wp="http://schemas.openxmlformats.org/drawingml/2006/wordprocessingDrawing" xmlns:w10="urn:schemas-microsoft-com:office:word" xmlns:w="http://schemas.openxmlformats.org/wordprocessingml/2006/main" xmlns:w14="http://schemas.microsoft.com/office/word/2010/wordml" xmlns:w15="http://schemas.microsoft.com/office/word/2012/wordml" xmlns:w16cex="http://schemas.microsoft.com/office/word/2018/wordml/cex" xmlns:w16cid="http://schemas.microsoft.com/office/word/2016/wordml/cid" xmlns:w16="http://schemas.microsoft.com/office/word/2018/wordml" xmlns:w16du="http://schemas.microsoft.com/office/word/2023/wordml/word16du" xmlns:w16sdtdh="http://schemas.microsoft.com/office/word/2020/wordml/sdtdatahash" xmlns:w16sdtfl="http://schemas.microsoft.com/office/word/2024/wordml/sdtformatlock" xmlns:w16se="http://schemas.microsoft.com/office/word/2015/wordml/symex" xmlns:wpg="http://schemas.microsoft.com/office/word/2010/wordprocessingGroup" xmlns:wpi="http://schemas.microsoft.com/office/word/2010/wordprocessingInk" xmlns:wne="http://schemas.microsoft.com/office/word/2006/wordml" xmlns:wps="http://schemas.microsoft.com/office/word/2010/wordprocessingShape" mc:Ignorable="w14 w15 w16se w16cid w16 w16cex w16sdtdh w16sdtfl w16du wp14">
+<w:endnotes xmlns:wpc="http://schemas.microsoft.com/office/word/2010/wordprocessingCanvas" xmlns:cx="http://schemas.microsoft.com/office/drawing/2014/chartex" xmlns:cx1="http://schemas.microsoft.com/office/drawing/2015/9/8/chartex" xmlns:cx2="http://schemas.microsoft.com/office/drawing/2015/10/21/chartex" xmlns:cx3="http://schemas.microsoft.com/office/drawing/2016/5/9/chartex" xmlns:cx4="http://schemas.microsoft.com/office/drawing/2016/5/10/chartex" xmlns:cx5="http://schemas.microsoft.com/office/drawing/2016/5/11/chartex" xmlns:cx6="http://schemas.microsoft.com/office/drawing/2016/5/12/chartex" xmlns:cx7="http://schemas.microsoft.com/office/drawing/2016/5/13/chartex" xmlns:cx8="http://schemas.microsoft.com/office/drawing/2016/5/14/chartex" xmlns:mc="http://schemas.openxmlformats.org/markup-compatibility/2006" xmlns:m="http://schemas.openxmlformats.org/officeDocument/2006/math" xmlns:aink="http://schemas.microsoft.com/office/drawing/2016/ink" xmlns:am3d="http://schemas.microsoft.com/office/drawing/2017/model3d" xmlns:oel="http://schemas.microsoft.com/office/2019/extlst" xmlns:r="http://schemas.openxmlformats.org/officeDocument/2006/relationships" xmlns:wp14="http://schemas.microsoft.com/office/word/2010/wordprocessingDrawing" xmlns:wp="http://schemas.openxmlformats.org/drawingml/2006/wordprocessingDrawing" xmlns:wpg="http://schemas.microsoft.com/office/word/2010/wordprocessingGroup" xmlns:wpi="http://schemas.microsoft.com/office/word/2010/wordprocessingInk" xmlns:wps="http://schemas.microsoft.com/office/word/2010/wordprocessingShape" xmlns:o="urn:schemas-microsoft-com:office:office" xmlns:v="urn:schemas-microsoft-com:vml" xmlns:w10="urn:schemas-microsoft-com:office:word" xmlns:w="http://schemas.openxmlformats.org/wordprocessingml/2006/main" xmlns:w14="http://schemas.microsoft.com/office/word/2010/wordml" xmlns:w15="http://schemas.microsoft.com/office/word/2012/wordml" xmlns:w16cex="http://schemas.microsoft.com/office/word/2018/wordml/cex" xmlns:w16cid="http://schemas.microsoft.com/office/word/2016/wordml/cid" xmlns:w16="http://schemas.microsoft.com/office/word/2018/wordml" xmlns:w16sdtdh="http://schemas.microsoft.com/office/word/2020/wordml/sdtdatahash" xmlns:w16sdtfl="http://schemas.microsoft.com/office/word/2024/wordml/sdtformatlock" xmlns:w16se="http://schemas.microsoft.com/office/word/2015/wordml/symex" xmlns:w16du="http://schemas.microsoft.com/office/word/2023/wordml/word16du" xmlns:wne="http://schemas.microsoft.com/office/word/2006/wordml" mc:Ignorable="w14 w15 w16se w16cid w16 w16cex w16sdtdh w16sdtfl w16du wp14">
   <w:endnote w:type="separator" w:id="-1">
     <w:p>
       <w:pPr>
@@ -1824,7 +1768,7 @@
 </file>
 
 <file path=word/footnotes.xml><?xml version="1.0" encoding="utf-8"?>
-<w:footnotes xmlns:wpc="http://schemas.microsoft.com/office/word/2010/wordprocessingCanvas" xmlns:cx="http://schemas.microsoft.com/office/drawing/2014/chartex" xmlns:cx1="http://schemas.microsoft.com/office/drawing/2015/9/8/chartex" xmlns:cx2="http://schemas.microsoft.com/office/drawing/2015/10/21/chartex" xmlns:cx3="http://schemas.microsoft.com/office/drawing/2016/5/9/chartex" xmlns:cx4="http://schemas.microsoft.com/office/drawing/2016/5/10/chartex" xmlns:cx5="http://schemas.microsoft.com/office/drawing/2016/5/11/chartex" xmlns:cx6="http://schemas.microsoft.com/office/drawing/2016/5/12/chartex" xmlns:cx7="http://schemas.microsoft.com/office/drawing/2016/5/13/chartex" xmlns:cx8="http://schemas.microsoft.com/office/drawing/2016/5/14/chartex" xmlns:mc="http://schemas.openxmlformats.org/markup-compatibility/2006" xmlns:aink="http://schemas.microsoft.com/office/drawing/2016/ink" xmlns:am3d="http://schemas.microsoft.com/office/drawing/2017/model3d" xmlns:o="urn:schemas-microsoft-com:office:office" xmlns:oel="http://schemas.microsoft.com/office/2019/extlst" xmlns:r="http://schemas.openxmlformats.org/officeDocument/2006/relationships" xmlns:m="http://schemas.openxmlformats.org/officeDocument/2006/math" xmlns:v="urn:schemas-microsoft-com:vml" xmlns:wp14="http://schemas.microsoft.com/office/word/2010/wordprocessingDrawing" xmlns:wp="http://schemas.openxmlformats.org/drawingml/2006/wordprocessingDrawing" xmlns:w10="urn:schemas-microsoft-com:office:word" xmlns:w="http://schemas.openxmlformats.org/wordprocessingml/2006/main" xmlns:w14="http://schemas.microsoft.com/office/word/2010/wordml" xmlns:w15="http://schemas.microsoft.com/office/word/2012/wordml" xmlns:w16cex="http://schemas.microsoft.com/office/word/2018/wordml/cex" xmlns:w16cid="http://schemas.microsoft.com/office/word/2016/wordml/cid" xmlns:w16="http://schemas.microsoft.com/office/word/2018/wordml" xmlns:w16du="http://schemas.microsoft.com/office/word/2023/wordml/word16du" xmlns:w16sdtdh="http://schemas.microsoft.com/office/word/2020/wordml/sdtdatahash" xmlns:w16sdtfl="http://schemas.microsoft.com/office/word/2024/wordml/sdtformatlock" xmlns:w16se="http://schemas.microsoft.com/office/word/2015/wordml/symex" xmlns:wpg="http://schemas.microsoft.com/office/word/2010/wordprocessingGroup" xmlns:wpi="http://schemas.microsoft.com/office/word/2010/wordprocessingInk" xmlns:wne="http://schemas.microsoft.com/office/word/2006/wordml" xmlns:wps="http://schemas.microsoft.com/office/word/2010/wordprocessingShape" mc:Ignorable="w14 w15 w16se w16cid w16 w16cex w16sdtdh w16sdtfl w16du wp14">
+<w:footnotes xmlns:wpc="http://schemas.microsoft.com/office/word/2010/wordprocessingCanvas" xmlns:cx="http://schemas.microsoft.com/office/drawing/2014/chartex" xmlns:cx1="http://schemas.microsoft.com/office/drawing/2015/9/8/chartex" xmlns:cx2="http://schemas.microsoft.com/office/drawing/2015/10/21/chartex" xmlns:cx3="http://schemas.microsoft.com/office/drawing/2016/5/9/chartex" xmlns:cx4="http://schemas.microsoft.com/office/drawing/2016/5/10/chartex" xmlns:cx5="http://schemas.microsoft.com/office/drawing/2016/5/11/chartex" xmlns:cx6="http://schemas.microsoft.com/office/drawing/2016/5/12/chartex" xmlns:cx7="http://schemas.microsoft.com/office/drawing/2016/5/13/chartex" xmlns:cx8="http://schemas.microsoft.com/office/drawing/2016/5/14/chartex" xmlns:mc="http://schemas.openxmlformats.org/markup-compatibility/2006" xmlns:m="http://schemas.openxmlformats.org/officeDocument/2006/math" xmlns:aink="http://schemas.microsoft.com/office/drawing/2016/ink" xmlns:am3d="http://schemas.microsoft.com/office/drawing/2017/model3d" xmlns:oel="http://schemas.microsoft.com/office/2019/extlst" xmlns:r="http://schemas.openxmlformats.org/officeDocument/2006/relationships" xmlns:wp14="http://schemas.microsoft.com/office/word/2010/wordprocessingDrawing" xmlns:wp="http://schemas.openxmlformats.org/drawingml/2006/wordprocessingDrawing" xmlns:wpg="http://schemas.microsoft.com/office/word/2010/wordprocessingGroup" xmlns:wpi="http://schemas.microsoft.com/office/word/2010/wordprocessingInk" xmlns:wps="http://schemas.microsoft.com/office/word/2010/wordprocessingShape" xmlns:o="urn:schemas-microsoft-com:office:office" xmlns:v="urn:schemas-microsoft-com:vml" xmlns:w10="urn:schemas-microsoft-com:office:word" xmlns:w="http://schemas.openxmlformats.org/wordprocessingml/2006/main" xmlns:w14="http://schemas.microsoft.com/office/word/2010/wordml" xmlns:w15="http://schemas.microsoft.com/office/word/2012/wordml" xmlns:w16cex="http://schemas.microsoft.com/office/word/2018/wordml/cex" xmlns:w16cid="http://schemas.microsoft.com/office/word/2016/wordml/cid" xmlns:w16="http://schemas.microsoft.com/office/word/2018/wordml" xmlns:w16sdtdh="http://schemas.microsoft.com/office/word/2020/wordml/sdtdatahash" xmlns:w16sdtfl="http://schemas.microsoft.com/office/word/2024/wordml/sdtformatlock" xmlns:w16se="http://schemas.microsoft.com/office/word/2015/wordml/symex" xmlns:w16du="http://schemas.microsoft.com/office/word/2023/wordml/word16du" xmlns:wne="http://schemas.microsoft.com/office/word/2006/wordml" mc:Ignorable="w14 w15 w16se w16cid w16 w16cex w16sdtdh w16sdtfl w16du wp14">
   <w:footnote w:type="separator" w:id="-1">
     <w:p>
       <w:pPr>
@@ -1849,7 +1793,7 @@
 </file>
 
 <file path=word/header1.xml><?xml version="1.0" encoding="utf-8"?>
-<w:hdr xmlns:wpc="http://schemas.microsoft.com/office/word/2010/wordprocessingCanvas" xmlns:cx="http://schemas.microsoft.com/office/drawing/2014/chartex" xmlns:cx1="http://schemas.microsoft.com/office/drawing/2015/9/8/chartex" xmlns:cx2="http://schemas.microsoft.com/office/drawing/2015/10/21/chartex" xmlns:cx3="http://schemas.microsoft.com/office/drawing/2016/5/9/chartex" xmlns:cx4="http://schemas.microsoft.com/office/drawing/2016/5/10/chartex" xmlns:cx5="http://schemas.microsoft.com/office/drawing/2016/5/11/chartex" xmlns:cx6="http://schemas.microsoft.com/office/drawing/2016/5/12/chartex" xmlns:cx7="http://schemas.microsoft.com/office/drawing/2016/5/13/chartex" xmlns:cx8="http://schemas.microsoft.com/office/drawing/2016/5/14/chartex" xmlns:mc="http://schemas.openxmlformats.org/markup-compatibility/2006" xmlns:aink="http://schemas.microsoft.com/office/drawing/2016/ink" xmlns:am3d="http://schemas.microsoft.com/office/drawing/2017/model3d" xmlns:o="urn:schemas-microsoft-com:office:office" xmlns:oel="http://schemas.microsoft.com/office/2019/extlst" xmlns:r="http://schemas.openxmlformats.org/officeDocument/2006/relationships" xmlns:m="http://schemas.openxmlformats.org/officeDocument/2006/math" xmlns:v="urn:schemas-microsoft-com:vml" xmlns:wp14="http://schemas.microsoft.com/office/word/2010/wordprocessingDrawing" xmlns:wp="http://schemas.openxmlformats.org/drawingml/2006/wordprocessingDrawing" xmlns:w10="urn:schemas-microsoft-com:office:word" xmlns:w="http://schemas.openxmlformats.org/wordprocessingml/2006/main" xmlns:w14="http://schemas.microsoft.com/office/word/2010/wordml" xmlns:w15="http://schemas.microsoft.com/office/word/2012/wordml" xmlns:w16cex="http://schemas.microsoft.com/office/word/2018/wordml/cex" xmlns:w16cid="http://schemas.microsoft.com/office/word/2016/wordml/cid" xmlns:w16="http://schemas.microsoft.com/office/word/2018/wordml" xmlns:w16du="http://schemas.microsoft.com/office/word/2023/wordml/word16du" xmlns:w16sdtdh="http://schemas.microsoft.com/office/word/2020/wordml/sdtdatahash" xmlns:w16sdtfl="http://schemas.microsoft.com/office/word/2024/wordml/sdtformatlock" xmlns:w16se="http://schemas.microsoft.com/office/word/2015/wordml/symex" xmlns:wpg="http://schemas.microsoft.com/office/word/2010/wordprocessingGroup" xmlns:wpi="http://schemas.microsoft.com/office/word/2010/wordprocessingInk" xmlns:wne="http://schemas.microsoft.com/office/word/2006/wordml" xmlns:wps="http://schemas.microsoft.com/office/word/2010/wordprocessingShape" mc:Ignorable="w14 w15 w16se w16cid w16 w16cex w16sdtdh w16sdtfl w16du wp14">
+<w:hdr xmlns:wpc="http://schemas.microsoft.com/office/word/2010/wordprocessingCanvas" xmlns:cx="http://schemas.microsoft.com/office/drawing/2014/chartex" xmlns:cx1="http://schemas.microsoft.com/office/drawing/2015/9/8/chartex" xmlns:cx2="http://schemas.microsoft.com/office/drawing/2015/10/21/chartex" xmlns:cx3="http://schemas.microsoft.com/office/drawing/2016/5/9/chartex" xmlns:cx4="http://schemas.microsoft.com/office/drawing/2016/5/10/chartex" xmlns:cx5="http://schemas.microsoft.com/office/drawing/2016/5/11/chartex" xmlns:cx6="http://schemas.microsoft.com/office/drawing/2016/5/12/chartex" xmlns:cx7="http://schemas.microsoft.com/office/drawing/2016/5/13/chartex" xmlns:cx8="http://schemas.microsoft.com/office/drawing/2016/5/14/chartex" xmlns:mc="http://schemas.openxmlformats.org/markup-compatibility/2006" xmlns:m="http://schemas.openxmlformats.org/officeDocument/2006/math" xmlns:aink="http://schemas.microsoft.com/office/drawing/2016/ink" xmlns:am3d="http://schemas.microsoft.com/office/drawing/2017/model3d" xmlns:oel="http://schemas.microsoft.com/office/2019/extlst" xmlns:r="http://schemas.openxmlformats.org/officeDocument/2006/relationships" xmlns:wp14="http://schemas.microsoft.com/office/word/2010/wordprocessingDrawing" xmlns:wp="http://schemas.openxmlformats.org/drawingml/2006/wordprocessingDrawing" xmlns:wpg="http://schemas.microsoft.com/office/word/2010/wordprocessingGroup" xmlns:wpi="http://schemas.microsoft.com/office/word/2010/wordprocessingInk" xmlns:wps="http://schemas.microsoft.com/office/word/2010/wordprocessingShape" xmlns:o="urn:schemas-microsoft-com:office:office" xmlns:v="urn:schemas-microsoft-com:vml" xmlns:w10="urn:schemas-microsoft-com:office:word" xmlns:w="http://schemas.openxmlformats.org/wordprocessingml/2006/main" xmlns:w14="http://schemas.microsoft.com/office/word/2010/wordml" xmlns:w15="http://schemas.microsoft.com/office/word/2012/wordml" xmlns:w16cex="http://schemas.microsoft.com/office/word/2018/wordml/cex" xmlns:w16cid="http://schemas.microsoft.com/office/word/2016/wordml/cid" xmlns:w16="http://schemas.microsoft.com/office/word/2018/wordml" xmlns:w16sdtdh="http://schemas.microsoft.com/office/word/2020/wordml/sdtdatahash" xmlns:w16sdtfl="http://schemas.microsoft.com/office/word/2024/wordml/sdtformatlock" xmlns:w16se="http://schemas.microsoft.com/office/word/2015/wordml/symex" xmlns:w16du="http://schemas.microsoft.com/office/word/2023/wordml/word16du" xmlns:wne="http://schemas.microsoft.com/office/word/2006/wordml" mc:Ignorable="w14 w15 w16se w16cid w16 w16cex w16sdtdh w16sdtfl w16du wp14">
   <w:p>
     <w:pPr>
       <w:pStyle w:val="Header"/>
@@ -1938,7 +1882,7 @@
 </file>
 
 <file path=word/numbering.xml><?xml version="1.0" encoding="utf-8"?>
-<w:numbering xmlns:wpc="http://schemas.microsoft.com/office/word/2010/wordprocessingCanvas" xmlns:cx="http://schemas.microsoft.com/office/drawing/2014/chartex" xmlns:cx1="http://schemas.microsoft.com/office/drawing/2015/9/8/chartex" xmlns:cx2="http://schemas.microsoft.com/office/drawing/2015/10/21/chartex" xmlns:cx3="http://schemas.microsoft.com/office/drawing/2016/5/9/chartex" xmlns:cx4="http://schemas.microsoft.com/office/drawing/2016/5/10/chartex" xmlns:cx5="http://schemas.microsoft.com/office/drawing/2016/5/11/chartex" xmlns:cx6="http://schemas.microsoft.com/office/drawing/2016/5/12/chartex" xmlns:cx7="http://schemas.microsoft.com/office/drawing/2016/5/13/chartex" xmlns:cx8="http://schemas.microsoft.com/office/drawing/2016/5/14/chartex" xmlns:mc="http://schemas.openxmlformats.org/markup-compatibility/2006" xmlns:aink="http://schemas.microsoft.com/office/drawing/2016/ink" xmlns:am3d="http://schemas.microsoft.com/office/drawing/2017/model3d" xmlns:o="urn:schemas-microsoft-com:office:office" xmlns:oel="http://schemas.microsoft.com/office/2019/extlst" xmlns:r="http://schemas.openxmlformats.org/officeDocument/2006/relationships" xmlns:m="http://schemas.openxmlformats.org/officeDocument/2006/math" xmlns:v="urn:schemas-microsoft-com:vml" xmlns:wp14="http://schemas.microsoft.com/office/word/2010/wordprocessingDrawing" xmlns:wp="http://schemas.openxmlformats.org/drawingml/2006/wordprocessingDrawing" xmlns:w10="urn:schemas-microsoft-com:office:word" xmlns:w="http://schemas.openxmlformats.org/wordprocessingml/2006/main" xmlns:w14="http://schemas.microsoft.com/office/word/2010/wordml" xmlns:w15="http://schemas.microsoft.com/office/word/2012/wordml" xmlns:w16cex="http://schemas.microsoft.com/office/word/2018/wordml/cex" xmlns:w16cid="http://schemas.microsoft.com/office/word/2016/wordml/cid" xmlns:w16="http://schemas.microsoft.com/office/word/2018/wordml" xmlns:w16du="http://schemas.microsoft.com/office/word/2023/wordml/word16du" xmlns:w16sdtdh="http://schemas.microsoft.com/office/word/2020/wordml/sdtdatahash" xmlns:w16sdtfl="http://schemas.microsoft.com/office/word/2024/wordml/sdtformatlock" xmlns:w16se="http://schemas.microsoft.com/office/word/2015/wordml/symex" xmlns:wpg="http://schemas.microsoft.com/office/word/2010/wordprocessingGroup" xmlns:wpi="http://schemas.microsoft.com/office/word/2010/wordprocessingInk" xmlns:wne="http://schemas.microsoft.com/office/word/2006/wordml" xmlns:wps="http://schemas.microsoft.com/office/word/2010/wordprocessingShape" mc:Ignorable="w14 w15 w16se w16cid w16 w16cex w16sdtdh w16sdtfl w16du wp14">
+<w:numbering xmlns:wpc="http://schemas.microsoft.com/office/word/2010/wordprocessingCanvas" xmlns:cx="http://schemas.microsoft.com/office/drawing/2014/chartex" xmlns:cx1="http://schemas.microsoft.com/office/drawing/2015/9/8/chartex" xmlns:cx2="http://schemas.microsoft.com/office/drawing/2015/10/21/chartex" xmlns:cx3="http://schemas.microsoft.com/office/drawing/2016/5/9/chartex" xmlns:cx4="http://schemas.microsoft.com/office/drawing/2016/5/10/chartex" xmlns:cx5="http://schemas.microsoft.com/office/drawing/2016/5/11/chartex" xmlns:cx6="http://schemas.microsoft.com/office/drawing/2016/5/12/chartex" xmlns:cx7="http://schemas.microsoft.com/office/drawing/2016/5/13/chartex" xmlns:cx8="http://schemas.microsoft.com/office/drawing/2016/5/14/chartex" xmlns:mc="http://schemas.openxmlformats.org/markup-compatibility/2006" xmlns:m="http://schemas.openxmlformats.org/officeDocument/2006/math" xmlns:aink="http://schemas.microsoft.com/office/drawing/2016/ink" xmlns:am3d="http://schemas.microsoft.com/office/drawing/2017/model3d" xmlns:oel="http://schemas.microsoft.com/office/2019/extlst" xmlns:r="http://schemas.openxmlformats.org/officeDocument/2006/relationships" xmlns:wp14="http://schemas.microsoft.com/office/word/2010/wordprocessingDrawing" xmlns:wp="http://schemas.openxmlformats.org/drawingml/2006/wordprocessingDrawing" xmlns:wpg="http://schemas.microsoft.com/office/word/2010/wordprocessingGroup" xmlns:wpi="http://schemas.microsoft.com/office/word/2010/wordprocessingInk" xmlns:wps="http://schemas.microsoft.com/office/word/2010/wordprocessingShape" xmlns:o="urn:schemas-microsoft-com:office:office" xmlns:v="urn:schemas-microsoft-com:vml" xmlns:w10="urn:schemas-microsoft-com:office:word" xmlns:w="http://schemas.openxmlformats.org/wordprocessingml/2006/main" xmlns:w14="http://schemas.microsoft.com/office/word/2010/wordml" xmlns:w15="http://schemas.microsoft.com/office/word/2012/wordml" xmlns:w16cex="http://schemas.microsoft.com/office/word/2018/wordml/cex" xmlns:w16cid="http://schemas.microsoft.com/office/word/2016/wordml/cid" xmlns:w16="http://schemas.microsoft.com/office/word/2018/wordml" xmlns:w16sdtdh="http://schemas.microsoft.com/office/word/2020/wordml/sdtdatahash" xmlns:w16sdtfl="http://schemas.microsoft.com/office/word/2024/wordml/sdtformatlock" xmlns:w16se="http://schemas.microsoft.com/office/word/2015/wordml/symex" xmlns:w16du="http://schemas.microsoft.com/office/word/2023/wordml/word16du" xmlns:wne="http://schemas.microsoft.com/office/word/2006/wordml" mc:Ignorable="w14 w15 w16se w16cid w16 w16cex w16sdtdh w16sdtfl w16du wp14">
   <w:abstractNum w:abstractNumId="0" w15:restartNumberingAfterBreak="0">
     <w:nsid w:val="41436035"/>
     <w:multiLevelType w:val="hybridMultilevel"/>
@@ -2129,7 +2073,7 @@
 </file>
 
 <file path=word/styles.xml><?xml version="1.0" encoding="utf-8"?>
-<w:styles xmlns:mc="http://schemas.openxmlformats.org/markup-compatibility/2006" xmlns:r="http://schemas.openxmlformats.org/officeDocument/2006/relationships" xmlns:w="http://schemas.openxmlformats.org/wordprocessingml/2006/main" xmlns:w14="http://schemas.microsoft.com/office/word/2010/wordml" xmlns:w15="http://schemas.microsoft.com/office/word/2012/wordml" xmlns:w16cex="http://schemas.microsoft.com/office/word/2018/wordml/cex" xmlns:w16cid="http://schemas.microsoft.com/office/word/2016/wordml/cid" xmlns:w16="http://schemas.microsoft.com/office/word/2018/wordml" xmlns:w16du="http://schemas.microsoft.com/office/word/2023/wordml/word16du" xmlns:w16sdtdh="http://schemas.microsoft.com/office/word/2020/wordml/sdtdatahash" xmlns:w16sdtfl="http://schemas.microsoft.com/office/word/2024/wordml/sdtformatlock" xmlns:w16se="http://schemas.microsoft.com/office/word/2015/wordml/symex" mc:Ignorable="w14 w15 w16se w16cid w16 w16cex w16sdtdh w16sdtfl w16du">
+<w:styles xmlns:mc="http://schemas.openxmlformats.org/markup-compatibility/2006" xmlns:r="http://schemas.openxmlformats.org/officeDocument/2006/relationships" xmlns:w="http://schemas.openxmlformats.org/wordprocessingml/2006/main" xmlns:w14="http://schemas.microsoft.com/office/word/2010/wordml" xmlns:w15="http://schemas.microsoft.com/office/word/2012/wordml" xmlns:w16cex="http://schemas.microsoft.com/office/word/2018/wordml/cex" xmlns:w16cid="http://schemas.microsoft.com/office/word/2016/wordml/cid" xmlns:w16="http://schemas.microsoft.com/office/word/2018/wordml" xmlns:w16sdtdh="http://schemas.microsoft.com/office/word/2020/wordml/sdtdatahash" xmlns:w16sdtfl="http://schemas.microsoft.com/office/word/2024/wordml/sdtformatlock" xmlns:w16se="http://schemas.microsoft.com/office/word/2015/wordml/symex" xmlns:w16du="http://schemas.microsoft.com/office/word/2023/wordml/word16du" mc:Ignorable="w14 w15 w16se w16cid w16 w16cex w16sdtdh w16sdtfl w16du">
   <w:docDefaults>
     <w:rPrDefault>
       <w:rPr>

</xml_diff>